<commit_message>
Subliniat Galben ce trebuie schimbat si detaliat CRC-ul
</commit_message>
<xml_diff>
--- a/Proiect_RC.docx
+++ b/Proiect_RC.docx
@@ -65,8 +65,43 @@
         <w:spacing w:before="120" w:after="120"/>
         <w:jc w:val="center"/>
       </w:pPr>
-      <w:r>
-        <w:t>Profesor Îndrumător: S.l. Dr. Ing. Cristian Codău</w:t>
+      <w:proofErr w:type="spellStart"/>
+      <w:r>
+        <w:t>Profesor</w:t>
+      </w:r>
+      <w:proofErr w:type="spellEnd"/>
+      <w:r>
+        <w:t xml:space="preserve"> </w:t>
+      </w:r>
+      <w:proofErr w:type="spellStart"/>
+      <w:r>
+        <w:t>î</w:t>
+      </w:r>
+      <w:r>
+        <w:t>ndrumător</w:t>
+      </w:r>
+      <w:proofErr w:type="spellEnd"/>
+      <w:r>
+        <w:t xml:space="preserve">: </w:t>
+      </w:r>
+      <w:proofErr w:type="spellStart"/>
+      <w:r>
+        <w:t>S.l.</w:t>
+      </w:r>
+      <w:proofErr w:type="spellEnd"/>
+      <w:r>
+        <w:t xml:space="preserve"> Dr. Ing. </w:t>
+      </w:r>
+      <w:proofErr w:type="spellStart"/>
+      <w:r>
+        <w:t>C</w:t>
+      </w:r>
+      <w:r>
+        <w:t>odău</w:t>
+      </w:r>
+      <w:proofErr w:type="spellEnd"/>
+      <w:r>
+        <w:t xml:space="preserve"> Cristian</w:t>
       </w:r>
     </w:p>
     <w:p>
@@ -215,7 +250,21 @@
         <w:jc w:val="both"/>
       </w:pPr>
       <w:r>
-        <w:t xml:space="preserve">Simularea este structurată în trei etape: construirea scenariului satelit–aeronavă–sol, analiza accesului prin linie de vizibilitate directă (Line of Sight – LoS) și analiza închiderii bugetului de legătură (link closure). Un aspect central îl constituie degradarea semnalului în segmentele de zbor deasupra apelor internaționale, unde curbura terestră obstrucționează vizibilitatea față de stațiile de la sol. Soluția investigată în acest proiect constă în integrarea infrastructurii Space-Based ADS-B (SB-ADS-B), implementată prin constelația Iridium NEXT (66 sateliți LEO, altitudine ~780 km, înclinație ~86,4°), operată de Aireon LLC, care asigură acoperire globală continuă. Antena satelitului Iridium este modelată atât ca element izotrop, cât și ca antenă cu 48 de fascicole, conform specificațiilor FCC (Federal Communications Commission) </w:t>
+        <w:t>Simularea este structurată în trei etape: construirea scenariului satelit–aeronavă–sol, analiza accesului prin linie de vizibilitate directă (Line of Sight – LoS) și analiza închiderii bugetului de legătură (link closure). Un aspect central îl constituie degradarea semnalului în segmentele de zbor deasupra apelor internaționale, unde curbura terestră obstrucționează vizibilitatea față de stațiile de la sol. Soluția investigată în acest proiect constă în integrarea infrastructurii Space-Based ADS-B (SB-ADS-B), implementată prin constelația Iridium NEXT (66 sateliți LEO, altitudine ~780 km, înclinație ~86,4°), operată de Aireon LLC, care asigură acoperire globală continuă. Antena satelitului Iridium este modelată atât ca element izotrop, cât și ca antenă cu 48 de fascic</w:t>
+      </w:r>
+      <w:r>
+        <w:t>u</w:t>
+      </w:r>
+      <w:r>
+        <w:t xml:space="preserve">le, conform </w:t>
+      </w:r>
+      <w:proofErr w:type="spellStart"/>
+      <w:r>
+        <w:t>specificațiilor</w:t>
+      </w:r>
+      <w:proofErr w:type="spellEnd"/>
+      <w:r>
+        <w:t xml:space="preserve"> FCC (Federal Communications Commission) </w:t>
       </w:r>
       <w:proofErr w:type="spellStart"/>
       <w:r>
@@ -236,7 +285,23 @@
         <w:jc w:val="both"/>
       </w:pPr>
       <w:r>
-        <w:t xml:space="preserve">Configurația fizică a sistemului aeronavei include antene omnidirecționale cu diagramă toroidală de radiație, montate pe fețele superioară și inferioară ale fuzelajului. Selecția căii active de comunicație, terestră sau spațială, este guvernată de marja maximă de legătură (maximum link margin) calculată ca diferența dintre Eb/N₀ recepționat </w:t>
+        <w:t xml:space="preserve">Configurația fizică a sistemului aeronavei include antene omnidirecționale cu diagramă toroidală de radiație, montate pe fețele superioară și inferioară ale fuzelajului. Selecția căii active de comunicație, terestră sau spațială, este guvernată de marja maximă de legătură (maximum link margin) calculată ca diferența </w:t>
+      </w:r>
+      <w:proofErr w:type="spellStart"/>
+      <w:r>
+        <w:t>dintre</w:t>
+      </w:r>
+      <w:proofErr w:type="spellEnd"/>
+      <w:r>
+        <w:t xml:space="preserve"> Eb/N₀ </w:t>
+      </w:r>
+      <w:proofErr w:type="spellStart"/>
+      <w:r>
+        <w:t>recepționat</w:t>
+      </w:r>
+      <w:proofErr w:type="spellEnd"/>
+      <w:r>
+        <w:t xml:space="preserve"> </w:t>
       </w:r>
       <w:proofErr w:type="spellStart"/>
       <w:r>
@@ -692,7 +757,39 @@
         <w:t xml:space="preserve">Câmpul de Date / ME (56 biți): </w:t>
       </w:r>
       <w:r>
-        <w:t xml:space="preserve">Payload-ul propriu-zis. Acesta conține coordonatele spațiale (latitudine, longitudine), altitudinea barometrică/geometrică </w:t>
+        <w:t xml:space="preserve">Payload-ul propriu-zis. Acesta conține coordonatele spațiale (latitudine, </w:t>
+      </w:r>
+      <w:proofErr w:type="spellStart"/>
+      <w:r>
+        <w:t>longitudine</w:t>
+      </w:r>
+      <w:proofErr w:type="spellEnd"/>
+      <w:r>
+        <w:t xml:space="preserve">), </w:t>
+      </w:r>
+      <w:proofErr w:type="spellStart"/>
+      <w:r>
+        <w:t>altitudinea</w:t>
+      </w:r>
+      <w:proofErr w:type="spellEnd"/>
+      <w:r>
+        <w:t xml:space="preserve"> </w:t>
+      </w:r>
+      <w:proofErr w:type="spellStart"/>
+      <w:r>
+        <w:t>barometrică</w:t>
+      </w:r>
+      <w:proofErr w:type="spellEnd"/>
+      <w:r>
+        <w:t>/</w:t>
+      </w:r>
+      <w:proofErr w:type="spellStart"/>
+      <w:r>
+        <w:t>geometrică</w:t>
+      </w:r>
+      <w:proofErr w:type="spellEnd"/>
+      <w:r>
+        <w:t xml:space="preserve"> </w:t>
       </w:r>
       <w:proofErr w:type="spellStart"/>
       <w:r>
@@ -771,7 +868,23 @@
         <w:t xml:space="preserve">Paritate / CRC (24 biți): </w:t>
       </w:r>
       <w:r>
-        <w:t xml:space="preserve">Câmp esențial pentru detectarea erorilor de transmisie. Asigură validarea datelor la nivelul receptorului prin verificarea integrității celor 88 de biți precedenți; în cazul în care CRC-ul calculat nu corespunde cu cel recepționat, mesajul </w:t>
+        <w:t xml:space="preserve">Câmp esențial pentru detectarea erorilor de transmisie. Asigură validarea datelor la nivelul receptorului prin verificarea integrității celor 88 de biți precedenți; în cazul în care CRC-ul calculat nu corespunde cu cel </w:t>
+      </w:r>
+      <w:proofErr w:type="spellStart"/>
+      <w:r>
+        <w:t>recepționat</w:t>
+      </w:r>
+      <w:proofErr w:type="spellEnd"/>
+      <w:r>
+        <w:t xml:space="preserve">, </w:t>
+      </w:r>
+      <w:proofErr w:type="spellStart"/>
+      <w:r>
+        <w:t>mesajul</w:t>
+      </w:r>
+      <w:proofErr w:type="spellEnd"/>
+      <w:r>
+        <w:t xml:space="preserve"> </w:t>
       </w:r>
       <w:proofErr w:type="spellStart"/>
       <w:r>
@@ -837,7 +950,21 @@
         <w:t>Antenele Echipamentelor Terestre și de Bord.</w:t>
       </w:r>
       <w:r>
-        <w:t xml:space="preserve"> Pentru aeronave și stațiile de la sol (aeroporturi), sistemul este modelat folosind o antenă cu caracteristică de radiație izotropă. În mediul de simulare, aceasta este definită printr-o configurație elementară matriceală de tip array cu dimensiunea [1 1]. Această abordare garantează că recepția și transmisia semnalelor nu sunt condiționate de unghiurile de atitudine ale aeronavei pe durata zborului.</w:t>
+        <w:t xml:space="preserve"> Pentru aeronave și stațiile de la sol (aeroporturi), sistemul este modelat folosind o antenă cu caracteristică de radiație izotropă. În mediul de simulare, aceasta este definită printr-o configurație elementară matriceală de tip array cu dimensiunea [1 1]. Această abordare garantează că recepția și transmisia semnalelor nu sunt condiționate de unghiurile de </w:t>
+      </w:r>
+      <w:proofErr w:type="spellStart"/>
+      <w:r>
+        <w:t>a</w:t>
+      </w:r>
+      <w:r>
+        <w:t>l</w:t>
+      </w:r>
+      <w:r>
+        <w:t>titudine</w:t>
+      </w:r>
+      <w:proofErr w:type="spellEnd"/>
+      <w:r>
+        <w:t xml:space="preserve"> ale aeronavei pe durata zborului.</w:t>
       </w:r>
     </w:p>
     <w:p/>
@@ -884,7 +1011,23 @@
         <w:t>Antenele de la Bordul Aeronavelor.</w:t>
       </w:r>
       <w:r>
-        <w:t xml:space="preserve"> În practica aviatică reală, transponderele ADS-B de la bordul aeronavelor utilizează antene de tip blade (lamă) sau monopol, cu polarizare verticală și caracteristică de radiație omnidirecțională în plan azimutal, operate la frecvența de 1090 MHz, în conformitate cu specificațiile TSO-C166b. Aceste antene sunt polarizate vertical și omnidirecționale, oferind un câștig de recepție superior față de un monopol λ/4 pe 90% din volumul de acoperire, pe toate direcțiile azimutale și între −15° și +20° în elevație.</w:t>
+        <w:t xml:space="preserve"> În practica aviatică reală, transponderele ADS-B de la bordul aeronavelor utilizează antene de tip blade (lamă) sau monopol, cu polarizare verticală și caracteristică de radiație omnidirecțională în plan azimutal, operate la </w:t>
+      </w:r>
+      <w:proofErr w:type="spellStart"/>
+      <w:r>
+        <w:t>frecvența</w:t>
+      </w:r>
+      <w:proofErr w:type="spellEnd"/>
+      <w:r>
+        <w:t xml:space="preserve"> de 1090 </w:t>
+      </w:r>
+      <w:proofErr w:type="spellStart"/>
+      <w:r>
+        <w:t>MHz.</w:t>
+      </w:r>
+      <w:proofErr w:type="spellEnd"/>
+      <w:r>
+        <w:t xml:space="preserve"> Aceste antene sunt polarizate vertical și omnidirecționale, oferind un câștig de recepție superior față de un monopol λ/4 pe 90% din volumul de acoperire, pe toate direcțiile azimutale și între −15° și +20° în elevație.</w:t>
       </w:r>
     </w:p>
     <w:p/>
@@ -895,7 +1038,87 @@
       </w:pPr>
       <w:r>
         <w:lastRenderedPageBreak/>
-        <w:t xml:space="preserve">Un aspect esențial al instalării reale este diversitatea de antenă (antenna diversity). Aceasta presupune montarea a două antene: una în partea superioară a aeronavei și una în partea inferioară, ambele funcționând pe frecvențele ADS-B. Semnalul este transmis prin cele două antene în mod alternant, cadru cu cadru (squitter cu squitter), nu pe baza unui interval de </w:t>
+        <w:t xml:space="preserve">Un aspect esențial al instalării reale este diversitatea de antenă (antenna diversity). Aceasta presupune montarea a două antene: una </w:t>
+      </w:r>
+      <w:proofErr w:type="spellStart"/>
+      <w:r>
+        <w:t>în</w:t>
+      </w:r>
+      <w:proofErr w:type="spellEnd"/>
+      <w:r>
+        <w:t xml:space="preserve"> </w:t>
+      </w:r>
+      <w:proofErr w:type="spellStart"/>
+      <w:r>
+        <w:t>partea</w:t>
+      </w:r>
+      <w:proofErr w:type="spellEnd"/>
+      <w:r>
+        <w:t xml:space="preserve"> </w:t>
+      </w:r>
+      <w:proofErr w:type="spellStart"/>
+      <w:r>
+        <w:t>superioară</w:t>
+      </w:r>
+      <w:proofErr w:type="spellEnd"/>
+      <w:r>
+        <w:t xml:space="preserve"> </w:t>
+      </w:r>
+      <w:proofErr w:type="gramStart"/>
+      <w:r>
+        <w:t>a</w:t>
+      </w:r>
+      <w:proofErr w:type="gramEnd"/>
+      <w:r>
+        <w:t xml:space="preserve"> </w:t>
+      </w:r>
+      <w:proofErr w:type="spellStart"/>
+      <w:r>
+        <w:t>aeronavei</w:t>
+      </w:r>
+      <w:proofErr w:type="spellEnd"/>
+      <w:r>
+        <w:t xml:space="preserve"> </w:t>
+      </w:r>
+      <w:proofErr w:type="spellStart"/>
+      <w:r>
+        <w:t>și</w:t>
+      </w:r>
+      <w:proofErr w:type="spellEnd"/>
+      <w:r>
+        <w:t xml:space="preserve"> </w:t>
+      </w:r>
+      <w:proofErr w:type="spellStart"/>
+      <w:r>
+        <w:t>una</w:t>
+      </w:r>
+      <w:proofErr w:type="spellEnd"/>
+      <w:r>
+        <w:t xml:space="preserve"> </w:t>
+      </w:r>
+      <w:proofErr w:type="spellStart"/>
+      <w:r>
+        <w:t>în</w:t>
+      </w:r>
+      <w:proofErr w:type="spellEnd"/>
+      <w:r>
+        <w:t xml:space="preserve"> </w:t>
+      </w:r>
+      <w:proofErr w:type="spellStart"/>
+      <w:r>
+        <w:t>partea</w:t>
+      </w:r>
+      <w:proofErr w:type="spellEnd"/>
+      <w:r>
+        <w:t xml:space="preserve"> inferioară, ambele funcționând pe frecvențele ADS-B. Semnalul este transmis prin cele două antene în mod alternant, cadru cu cadru (squitter cu squitter), nu pe baza </w:t>
+      </w:r>
+      <w:proofErr w:type="spellStart"/>
+      <w:r>
+        <w:t>unui</w:t>
+      </w:r>
+      <w:proofErr w:type="spellEnd"/>
+      <w:r>
+        <w:t xml:space="preserve"> interval de </w:t>
       </w:r>
       <w:proofErr w:type="spellStart"/>
       <w:r>
@@ -938,7 +1161,53 @@
       </w:r>
       <w:proofErr w:type="spellEnd"/>
       <w:r>
-        <w:t xml:space="preserve"> la fiecare emisie succesivă, cu o rată nominală de aproximativ un mesaj la 400–600 ms per antenă, conform DO-260B. Antena montată pe partea superioară este preferabilă pentru recepția satelitară, deoarece asigură o linie de vedere directă către sateliții de pe orbită. Un sistem cu antenă exclusiv ventrală poate fi compromis de fuzelajul aeronavei, care blochează semnalul în direcția sateliților.</w:t>
+        <w:t xml:space="preserve"> la </w:t>
+      </w:r>
+      <w:proofErr w:type="spellStart"/>
+      <w:r>
+        <w:t>fiecare</w:t>
+      </w:r>
+      <w:proofErr w:type="spellEnd"/>
+      <w:r>
+        <w:t xml:space="preserve"> emisie succesivă, cu o rată nominală de aproximativ un mesaj la 400–600 </w:t>
+      </w:r>
+      <w:proofErr w:type="spellStart"/>
+      <w:r>
+        <w:t>ms</w:t>
+      </w:r>
+      <w:proofErr w:type="spellEnd"/>
+      <w:r>
+        <w:t xml:space="preserve"> per </w:t>
+      </w:r>
+      <w:r>
+        <w:t xml:space="preserve">antenna. </w:t>
+      </w:r>
+      <w:r>
+        <w:t xml:space="preserve">Antena </w:t>
+      </w:r>
+      <w:proofErr w:type="spellStart"/>
+      <w:r>
+        <w:t>montată</w:t>
+      </w:r>
+      <w:proofErr w:type="spellEnd"/>
+      <w:r>
+        <w:t xml:space="preserve"> pe </w:t>
+      </w:r>
+      <w:proofErr w:type="spellStart"/>
+      <w:r>
+        <w:t>partea</w:t>
+      </w:r>
+      <w:proofErr w:type="spellEnd"/>
+      <w:r>
+        <w:t xml:space="preserve"> </w:t>
+      </w:r>
+      <w:proofErr w:type="spellStart"/>
+      <w:r>
+        <w:t>superioară</w:t>
+      </w:r>
+      <w:proofErr w:type="spellEnd"/>
+      <w:r>
+        <w:t xml:space="preserve"> este preferabilă pentru recepția satelitară, deoarece asigură o linie de vedere directă către sateliții de pe orbită. Un sistem cu antenă exclusiv ventrală poate fi compromis de fuzelajul aeronavei, care blochează semnalul în direcția sateliților.</w:t>
       </w:r>
     </w:p>
     <w:p/>
@@ -948,7 +1217,71 @@
         <w:jc w:val="both"/>
       </w:pPr>
       <w:r>
-        <w:t xml:space="preserve">Reglementările actuale impun ca echipamentul ADS-B să respecte standardele de performanță minimă RTCA DO-260B și să dispună de capacitate de antenă pentru transmisie atât spre receptorii terești, cât și </w:t>
+        <w:t xml:space="preserve">Reglementările actuale impun ca echipamentul ADS-B să respecte standardele de </w:t>
+      </w:r>
+      <w:proofErr w:type="spellStart"/>
+      <w:r>
+        <w:t>performanță</w:t>
+      </w:r>
+      <w:proofErr w:type="spellEnd"/>
+      <w:r>
+        <w:t xml:space="preserve"> </w:t>
+      </w:r>
+      <w:proofErr w:type="spellStart"/>
+      <w:r>
+        <w:t>minimă</w:t>
+      </w:r>
+      <w:proofErr w:type="spellEnd"/>
+      <w:r>
+        <w:t xml:space="preserve"> </w:t>
+      </w:r>
+      <w:proofErr w:type="spellStart"/>
+      <w:r>
+        <w:t>și</w:t>
+      </w:r>
+      <w:proofErr w:type="spellEnd"/>
+      <w:r>
+        <w:t xml:space="preserve"> </w:t>
+      </w:r>
+      <w:proofErr w:type="spellStart"/>
+      <w:r>
+        <w:t>să</w:t>
+      </w:r>
+      <w:proofErr w:type="spellEnd"/>
+      <w:r>
+        <w:t xml:space="preserve"> </w:t>
+      </w:r>
+      <w:proofErr w:type="spellStart"/>
+      <w:r>
+        <w:t>dispună</w:t>
+      </w:r>
+      <w:proofErr w:type="spellEnd"/>
+      <w:r>
+        <w:t xml:space="preserve"> de capacitate de antenă pentru transmisie atât spre receptorii </w:t>
+      </w:r>
+      <w:proofErr w:type="spellStart"/>
+      <w:r>
+        <w:t>terești</w:t>
+      </w:r>
+      <w:proofErr w:type="spellEnd"/>
+      <w:r>
+        <w:t xml:space="preserve">, </w:t>
+      </w:r>
+      <w:proofErr w:type="spellStart"/>
+      <w:r>
+        <w:t>cât</w:t>
+      </w:r>
+      <w:proofErr w:type="spellEnd"/>
+      <w:r>
+        <w:t xml:space="preserve"> </w:t>
+      </w:r>
+      <w:proofErr w:type="spellStart"/>
+      <w:r>
+        <w:t>și</w:t>
+      </w:r>
+      <w:proofErr w:type="spellEnd"/>
+      <w:r>
+        <w:t xml:space="preserve"> </w:t>
       </w:r>
       <w:proofErr w:type="spellStart"/>
       <w:r>
@@ -996,7 +1329,15 @@
       </w:r>
       <w:proofErr w:type="spellEnd"/>
       <w:r>
-        <w:t xml:space="preserve"> diversitate de antenă (top + bottom), fie printr-o antenă unică cu acoperire bidirecțională. Această configurație omnidirecțională reală justifică modelarea simulată printr-o antenă radiantă izotropă [1×1]: indiferent de atitudinea aeronavei în zbor (viraj, cabraj, tangaj), semnalul ADS-B este radiat uniform în toate direcțiile, fără dependență de orientare.</w:t>
+        <w:t xml:space="preserve"> </w:t>
+      </w:r>
+      <w:proofErr w:type="spellStart"/>
+      <w:r>
+        <w:t>diversitate</w:t>
+      </w:r>
+      <w:proofErr w:type="spellEnd"/>
+      <w:r>
+        <w:t xml:space="preserve"> de antenă (top + bottom), fie printr-o antenă unică cu acoperire bidirecțională. Această configurație omnidirecțională reală justifică modelarea simulată printr-o antenă radiantă izotropă [1×1]: indiferent de atitudinea aeronavei în zbor (viraj, cabraj, tangaj), semnalul ADS-B este radiat uniform în toate direcțiile, fără dependență de orientare.</w:t>
       </w:r>
     </w:p>
     <w:p/>
@@ -1013,7 +1354,15 @@
         <w:t>Payload-ul ADS-B de pe Sateliții Iridium NEXT (Sistemul Aireon).</w:t>
       </w:r>
       <w:r>
-        <w:t xml:space="preserve"> La nivelul segmentului spațial, Harris Corporation (acum L3Harris) a furnizat 81 de payload-uri ADS-B de tip receptor 1090 Extended Squitter (ES), găzduite pe constelația de </w:t>
+        <w:t xml:space="preserve"> La nivelul segmentului spațial, Harris Corporation (acum L3Harris) a furnizat 81 de payload-uri ADS-B de tip receptor 1090 Extended Squitter (ES), găzduite pe </w:t>
+      </w:r>
+      <w:proofErr w:type="spellStart"/>
+      <w:r>
+        <w:t>constelația</w:t>
+      </w:r>
+      <w:proofErr w:type="spellEnd"/>
+      <w:r>
+        <w:t xml:space="preserve"> de </w:t>
       </w:r>
       <w:proofErr w:type="spellStart"/>
       <w:r>
@@ -1031,7 +1380,16 @@
         <w:jc w:val="both"/>
       </w:pPr>
       <w:r>
-        <w:t>Fiecare payload Aireon (AHP – Aireon Hosted Payload) suportă fascicule multiple, care creează o amprentă de acoperire robustă la suprafața Pământului, cu o distanță oblică (slant range) de aproximativ 3.200 km. Antena principală de misiune a sateliților Iridium generează 48 de fascicule punctuale (spot beams), organizate în 16 fascicule pe fiecare dintre cele trei sectoare ale satelitului. Această arhitectură multi-fascicul este tocmai cea reprodusă în mediul de simulare prin Custom 48-Beam Antenna, configurată cu un unghi de tangaj de −90° pentru a orienta fasciculele spre nadir (direct înspre suprafața Pământului).</w:t>
+        <w:t xml:space="preserve">Fiecare payload Aireon (AHP – Aireon Hosted Payload) suportă </w:t>
+      </w:r>
+      <w:r>
+        <w:rPr>
+          <w:highlight w:val="yellow"/>
+        </w:rPr>
+        <w:t>fascicule multipl</w:t>
+      </w:r>
+      <w:r>
+        <w:t>e, care creează o amprentă de acoperire robustă la suprafața Pământului, cu o distanță oblică (slant range) de aproximativ 3.200 km. Antena principală de misiune a sateliților Iridium generează 48 de fascicule punctuale (spot beams), organizate în 16 fascicule pe fiecare dintre cele trei sectoare ale satelitului. Această arhitectură multi-fascicul este tocmai cea reprodusă în mediul de simulare prin Custom 48-Beam Antenna, configurată cu un unghi de tangaj de −90° pentru a orienta fasciculele spre nadir (direct înspre suprafața Pământului).</w:t>
       </w:r>
     </w:p>
     <w:p/>
@@ -1059,7 +1417,23 @@
         <w:jc w:val="both"/>
       </w:pPr>
       <w:r>
-        <w:t xml:space="preserve">Rețeaua spațială este bazată pe </w:t>
+        <w:t xml:space="preserve">Rețeaua spațială </w:t>
+      </w:r>
+      <w:proofErr w:type="spellStart"/>
+      <w:r>
+        <w:t>este</w:t>
+      </w:r>
+      <w:proofErr w:type="spellEnd"/>
+      <w:r>
+        <w:t xml:space="preserve"> </w:t>
+      </w:r>
+      <w:proofErr w:type="spellStart"/>
+      <w:r>
+        <w:t>bazată</w:t>
+      </w:r>
+      <w:proofErr w:type="spellEnd"/>
+      <w:r>
+        <w:t xml:space="preserve"> pe </w:t>
       </w:r>
       <w:proofErr w:type="spellStart"/>
       <w:r>
@@ -1104,7 +1478,23 @@
         <w:jc w:val="both"/>
       </w:pPr>
       <w:r>
-        <w:t xml:space="preserve">Pentru a simula cu acuratețe vizibilitatea și timpii de acces, scenariul construiește un model matematic și fizic al Pământului. Constelația este distribuită pe Norbite = 6 planuri orbitale, </w:t>
+        <w:t xml:space="preserve">Pentru a simula cu acuratețe vizibilitatea și timpii de acces, scenariul construiește un model matematic și fizic al Pământului. Constelația este distribuită pe Norbite = 6 </w:t>
+      </w:r>
+      <w:proofErr w:type="spellStart"/>
+      <w:r>
+        <w:t>planuri</w:t>
+      </w:r>
+      <w:proofErr w:type="spellEnd"/>
+      <w:r>
+        <w:t xml:space="preserve"> </w:t>
+      </w:r>
+      <w:proofErr w:type="spellStart"/>
+      <w:r>
+        <w:t>orbitale</w:t>
+      </w:r>
+      <w:proofErr w:type="spellEnd"/>
+      <w:r>
+        <w:t xml:space="preserve">, </w:t>
       </w:r>
       <w:proofErr w:type="spellStart"/>
       <w:r>
@@ -1168,7 +1558,23 @@
         <w:t>Semiaxa mare (α) și Altitudinea:</w:t>
       </w:r>
       <w:r>
-        <w:t xml:space="preserve"> Altitudinea sateliților LEO este de 780 km. Semiaxa mare se calculează pornind de la centrul Pământului, </w:t>
+        <w:t xml:space="preserve"> Altitudinea sateliților LEO este de 780 km. Semiaxa mare se calculează pornind de la </w:t>
+      </w:r>
+      <w:proofErr w:type="spellStart"/>
+      <w:r>
+        <w:t>centrul</w:t>
+      </w:r>
+      <w:proofErr w:type="spellEnd"/>
+      <w:r>
+        <w:t xml:space="preserve"> </w:t>
+      </w:r>
+      <w:proofErr w:type="spellStart"/>
+      <w:r>
+        <w:t>Pământului</w:t>
+      </w:r>
+      <w:proofErr w:type="spellEnd"/>
+      <w:r>
+        <w:t xml:space="preserve">, </w:t>
       </w:r>
       <w:proofErr w:type="spellStart"/>
       <w:r>
@@ -1192,7 +1598,15 @@
       </w:r>
       <w:proofErr w:type="spellEnd"/>
       <w:r>
-        <w:t xml:space="preserve"> satelitului:</w:t>
+        <w:t xml:space="preserve"> </w:t>
+      </w:r>
+      <w:proofErr w:type="spellStart"/>
+      <w:r>
+        <w:t>satelitului</w:t>
+      </w:r>
+      <w:proofErr w:type="spellEnd"/>
+      <w:r>
+        <w:t>:</w:t>
       </w:r>
     </w:p>
     <w:p>
@@ -1447,7 +1861,21 @@
           <w:szCs w:val="24"/>
           <w:lang w:val="ro-RO"/>
         </w:rPr>
-        <w:t>La nivelul supravegherii terestre comerciale, studiul tehnicii a fost marcat de accesul la echipamente radio de tip SDR (Software Defined Radio). Cel mai cunoscut exemplu practic de implementare a standardului 1090ES este platforma Flightradar24. Aceasta operează o rețea globală de peste 30.000 de receptoare ADS-B independente, capabile să intercepteze și să centralizeze mesajele difuzate de transponderele aeronavelor. Transponderul de la bordul aeronavei determină poziția cu ajutorul receptorului GNSS propriu și o transmite omnidirecțional la 1090 MHz; receptoarele terestre ale rețelei Flightradar24 captează aceste emisii și le retransmit în timp real către serverele centrale prin intermediul internetului. Conform datelor publicate de Flightradar24, în 2024 peste 80% din zborurile comerciale monitorizate provin de la aeronave dotate cu transpondere ADS-B active, procent în continuă creștere odată cu extinderea mandatelor de echipare (FAA – 2020, EASA – 2020, CASA Australia – 2017). Rețeaua de receptoare acceptă o gamă largă de hardware: receptoarele proprietare FR24 distribuite contributorilor (bazate pe tehnologie RTL-SDR/DVB-T), decodoare dedicate precum SBS-1 de la Kinetic Avionics, dar și soluții software-defined configurate de utilizatori independenți.</w:t>
+        <w:t>La nivelul supravegherii terestre comerciale, studiul tehnicii a fost marcat de accesul la echipamente radio de tip SDR (Software Defined Radio). Cel mai cunoscut exemplu practic de implementare a standardului 1090ES este platforma Flightradar24. Aceasta operează o rețea globală de peste 30.000 de receptoare ADS-B independente, capabile să intercepteze și să centralizeze mesajele difuzate de transponderele aeronavelor. Transponderul de la bordul aeronavei determină poziția cu ajutorul receptorului GNSS propriu și o transmite omnidirecțional la 1090 MHz; receptoarele terestre ale rețelei Flightradar24 captează aceste emisii și le retransmit în timp real către serverele centrale prin intermediul internetului. Conform datelor publicate de Flightradar24, în 2024 peste 80% din zborurile comerciale monitorizate provin de la aeronave dotate cu transpondere ADS-B active, procent în continuă creștere odată cu extinderea mandatelor de echipare (FAA – 2020, EASA – 2020, CASA Australia – 2017).</w:t>
+      </w:r>
+    </w:p>
+    <w:p>
+      <w:pPr>
+        <w:pStyle w:val="Heading2"/>
+        <w:rPr>
+          <w:b w:val="0"/>
+          <w:bCs w:val="0"/>
+          <w:sz w:val="24"/>
+          <w:szCs w:val="24"/>
+        </w:rPr>
+      </w:pPr>
+      <w:r>
+        <w:t>3.2 Supravegherea spațială globală (Space-Based ADS-B): Sistemul Aireon</w:t>
       </w:r>
     </w:p>
     <w:p>
@@ -1468,40 +1896,28 @@
           <w:bCs w:val="0"/>
           <w:sz w:val="24"/>
           <w:szCs w:val="24"/>
-          <w:lang w:val="ro-RO"/>
-        </w:rPr>
-        <w:t xml:space="preserve">Deși o </w:t>
-      </w:r>
-      <w:proofErr w:type="spellStart"/>
-      <w:r>
-        <w:rPr>
-          <w:b w:val="0"/>
-          <w:bCs w:val="0"/>
-          <w:sz w:val="24"/>
-          <w:szCs w:val="24"/>
-          <w:lang w:val="ro-RO"/>
-        </w:rPr>
-        <w:t>astfee</w:t>
-      </w:r>
-      <w:proofErr w:type="spellEnd"/>
-      <w:r>
-        <w:rPr>
-          <w:b w:val="0"/>
-          <w:bCs w:val="0"/>
-          <w:sz w:val="24"/>
-          <w:szCs w:val="24"/>
-          <w:lang w:val="ro-RO"/>
-        </w:rPr>
-        <w:t xml:space="preserve"> rețea oferă o imagine în ansamblu detaliată deasupra zonelor continentale dens populate, ca și Europa sau SUA, ea este fundamental limitată de propagarea undelor electromagnetice în linie dreaptă (Line of Sight – LoS). Astfel, deasupra suprafețelor oceanice, curbura terestră reduce vizibilitatea față de stațiile de la sol, determinând </w:t>
-      </w:r>
-      <w:r>
-        <w:rPr>
-          <w:b w:val="0"/>
-          <w:bCs w:val="0"/>
-          <w:sz w:val="24"/>
-          <w:szCs w:val="24"/>
-        </w:rPr>
-        <w:t>“zone oarbe” masive în care monitorizarea în timp real devine imposibilă pentru echipamentele terestre.</w:t>
+        </w:rPr>
+        <w:t xml:space="preserve">Răspunsul tehnologic actual la limitările impuse de orizontul radio este sistemul Space-Based ADS-B (SB-ADS-B), a cărui implementare a fost realizată de compania Aireon LLC. În loc de a plasa antene pe sol, sistemul se bazează pe integrarea unor echipamente specializate de recepție ADS-B direct pe </w:t>
+      </w:r>
+      <w:proofErr w:type="spellStart"/>
+      <w:r>
+        <w:rPr>
+          <w:b w:val="0"/>
+          <w:bCs w:val="0"/>
+          <w:sz w:val="24"/>
+          <w:szCs w:val="24"/>
+        </w:rPr>
+        <w:t>constelația</w:t>
+      </w:r>
+      <w:proofErr w:type="spellEnd"/>
+      <w:r>
+        <w:rPr>
+          <w:b w:val="0"/>
+          <w:bCs w:val="0"/>
+          <w:sz w:val="24"/>
+          <w:szCs w:val="24"/>
+        </w:rPr>
+        <w:t xml:space="preserve"> NEXT. Această schimbare permite eliminarea lacunelor de acoperire oceanică și polară, oferind monitorizare globală 100% și neîntreruptă a aeronavelor.</w:t>
       </w:r>
     </w:p>
     <w:p>
@@ -1515,7 +1931,7 @@
         </w:rPr>
       </w:pPr>
       <w:r>
-        <w:t>3.2 Supravegherea spațială globală (Space-Based ADS-B): Sistemul Aireon</w:t>
+        <w:t>3.3 Inovații actuale: Detectarea și atenuarea interferențelor GNSS</w:t>
       </w:r>
     </w:p>
     <w:p>
@@ -1537,21 +1953,7 @@
           <w:sz w:val="24"/>
           <w:szCs w:val="24"/>
         </w:rPr>
-        <w:t>Răspunsul tehnologic actual la limitările impuse de orizontul radio este sistemul Space-Based ADS-B (SB-ADS-B), a cărui implementare a fost realizată de compania Aireon LLC. În loc de a plasa antene pe sol, sistemul se bazează pe integrarea unor echipamente specializate de recepție ADS-B direct pe constelația de 66 de sateliți LEO Iridium NEXT. Această schimbare permite eliminarea lacunelor de acoperire oceanică și polară, oferind monitorizare globală 100% și neîntreruptă a aeronavelor.</w:t>
-      </w:r>
-    </w:p>
-    <w:p>
-      <w:pPr>
-        <w:pStyle w:val="Heading2"/>
-        <w:rPr>
-          <w:b w:val="0"/>
-          <w:bCs w:val="0"/>
-          <w:sz w:val="24"/>
-          <w:szCs w:val="24"/>
-        </w:rPr>
-      </w:pPr>
-      <w:r>
-        <w:t>3.3 Inovații actuale: Detectarea și atenuarea interferențelor GNSS</w:t>
+        <w:t>Datorită caracterului “Dependent” al sistemului, funcționarea  acestuia este subordonată exclusiv acurateței coordonatelor furnizate de sistemul de navigație de la bordul aeronavei (GNSS/GPS). Prin urmare, cea mai mare vulnerabilitate a stadiului actual al tehnicii o reprezintă interferențele cu frecvențe radio (RFI – Radio Frequency Interference). Conform analizelor recente dezvoltate de Aireon pe infrastructura proprie, atenția s-a îndreptat către monitorizarea fenomenelor de GNSS Jamming (bruiaj) și Spoofing (falsificarea coordonatelor).</w:t>
       </w:r>
     </w:p>
     <w:p>
@@ -1573,17 +1975,16 @@
           <w:sz w:val="24"/>
           <w:szCs w:val="24"/>
         </w:rPr>
-        <w:t xml:space="preserve">Datorită caracterului “Dependent” al sistemului, funcționarea  acestuia este subordonată exclusiv acurateței coordonatelor furnizate de sistemul de navigație de la bordul aeronavei (GNSS/GPS). Prin urmare, cea mai mare vulnerabilitate a stadiului actual al tehnicii o reprezintă interferențele cu frecvențe radio (RFI – Radio Frequency Interference). Conform analizelor recente </w:t>
-      </w:r>
-      <w:r>
-        <w:rPr>
-          <w:b w:val="0"/>
-          <w:bCs w:val="0"/>
-          <w:sz w:val="24"/>
-          <w:szCs w:val="24"/>
-        </w:rPr>
+        <w:t>Implementările de pe sateliții Iridium acționează astăzi și ca senzori globali pentru securitatea spectrului radio. Prin monitorizarea continuă a indicatorilor de calitate incluși în pachetul de date ADS-B și analizând anomaliile dintre poziția raportată și momentul recepției pachetului pe orbită, infrastructura spațială poate identifica și alerta în timp real zonele în care semnalul GNSS este alterat. Astfel sistemele SB-ADS-B moderne au evoluat din platforme de monitorizare a zborurilor în sisteme critice pentru siguranța cibernetică și radio-electronică pentru spațiul aerian internațional.</w:t>
+      </w:r>
+    </w:p>
+    <w:p>
+      <w:pPr>
+        <w:pStyle w:val="Heading2"/>
+      </w:pPr>
+      <w:r>
         <w:lastRenderedPageBreak/>
-        <w:t>dezvoltate de Aireon pe infrastructura proprie, atenția s-a îndreptat către monitorizarea fenomenelor de GNSS Jamming (bruiaj) și Spoofing (falsificarea coordonatelor).</w:t>
+        <w:t>3.4 Vulnerabilitatea la interceptare și injectare</w:t>
       </w:r>
     </w:p>
     <w:p>
@@ -1605,15 +2006,7 @@
           <w:sz w:val="24"/>
           <w:szCs w:val="24"/>
         </w:rPr>
-        <w:t>Implementările de pe sateliții Iridium acționează astăzi și ca senzori globali pentru securitatea spectrului radio. Prin monitorizarea continuă a indicatorilor de calitate incluși în pachetul de date ADS-B și analizând anomaliile dintre poziția raportată și momentul recepției pachetului pe orbită, infrastructura spațială poate identifica și alerta în timp real zonele în care semnalul GNSS este alterat. Astfel sistemele SB-ADS-B moderne au evoluat din platforme de monitorizare a zborurilor în sisteme critice pentru siguranța cibernetică și radio-electronică pentru spațiul aerian internațional.</w:t>
-      </w:r>
-    </w:p>
-    <w:p>
-      <w:pPr>
-        <w:pStyle w:val="Heading2"/>
-      </w:pPr>
-      <w:r>
-        <w:t>3.4 Vulnerabilitatea la interceptare și injectare</w:t>
+        <w:t xml:space="preserve">Deși sistemele de tip Space-Based ADS-B rezolvă problema acoperirii geografice (stratul fizic), stadiul actual al tehnologiei se confruntă cu o vulnerabilitate fundamentală la nivelul legăturii de date. Standardul RTCA DO-260B, care guvernează emisiile ADS-B Out la 1090 MHz, a fost proiectat având ca priorități siguranța zborului, omițând aspectele de securitate informatică. În consecință, mesajele Extended Squitter sunt transmise în clar, nefiind protejate de niciun mecanism de criptare sau autentificare criptografică. Această arhitectură deschisă permite oricărei entități aflate în zona de acoperire radio să intercepteze datele zborului. </w:t>
       </w:r>
     </w:p>
     <w:p>
@@ -1635,7 +2028,156 @@
           <w:sz w:val="24"/>
           <w:szCs w:val="24"/>
         </w:rPr>
-        <w:t xml:space="preserve">Deși sistemele de tip Space-Based ADS-B rezolvă problema acoperirii geografice (stratul fizic), stadiul actual al tehnologiei se confruntă cu o vulnerabilitate fundamentală la nivelul legăturii de date. Standardul RTCA DO-260B, care guvernează emisiile ADS-B Out la 1090 MHz, a fost proiectat având ca priorități siguranța zborului, omițând aspectele de securitate informatică. În consecință, mesajele Extended Squitter sunt transmise în clar, nefiind protejate de niciun mecanism de criptare sau autentificare criptografică. Această arhitectură deschisă permite oricărei entități aflate în zona de acoperire radio să intercepteze datele zborului. </w:t>
+        <w:t>Prin intermediul tehnologiei SDR (</w:t>
+      </w:r>
+      <w:proofErr w:type="spellStart"/>
+      <w:r>
+        <w:rPr>
+          <w:b w:val="0"/>
+          <w:bCs w:val="0"/>
+          <w:sz w:val="24"/>
+          <w:szCs w:val="24"/>
+        </w:rPr>
+        <w:t>echipamente</w:t>
+      </w:r>
+      <w:proofErr w:type="spellEnd"/>
+      <w:r>
+        <w:rPr>
+          <w:b w:val="0"/>
+          <w:bCs w:val="0"/>
+          <w:sz w:val="24"/>
+          <w:szCs w:val="24"/>
+        </w:rPr>
+        <w:t xml:space="preserve"> radio </w:t>
+      </w:r>
+      <w:proofErr w:type="spellStart"/>
+      <w:r>
+        <w:rPr>
+          <w:b w:val="0"/>
+          <w:bCs w:val="0"/>
+          <w:sz w:val="24"/>
+          <w:szCs w:val="24"/>
+        </w:rPr>
+        <w:t>controlate</w:t>
+      </w:r>
+      <w:proofErr w:type="spellEnd"/>
+      <w:r>
+        <w:rPr>
+          <w:b w:val="0"/>
+          <w:bCs w:val="0"/>
+          <w:sz w:val="24"/>
+          <w:szCs w:val="24"/>
+        </w:rPr>
+        <w:t xml:space="preserve"> </w:t>
+      </w:r>
+      <w:proofErr w:type="spellStart"/>
+      <w:r>
+        <w:rPr>
+          <w:b w:val="0"/>
+          <w:bCs w:val="0"/>
+          <w:sz w:val="24"/>
+          <w:szCs w:val="24"/>
+        </w:rPr>
+        <w:t>prin</w:t>
+      </w:r>
+      <w:proofErr w:type="spellEnd"/>
+      <w:r>
+        <w:rPr>
+          <w:b w:val="0"/>
+          <w:bCs w:val="0"/>
+          <w:sz w:val="24"/>
+          <w:szCs w:val="24"/>
+        </w:rPr>
+        <w:t xml:space="preserve"> software</w:t>
+      </w:r>
+      <w:r>
+        <w:rPr>
+          <w:b w:val="0"/>
+          <w:bCs w:val="0"/>
+          <w:sz w:val="24"/>
+          <w:szCs w:val="24"/>
+        </w:rPr>
+        <w:t xml:space="preserve">) </w:t>
+      </w:r>
+      <w:proofErr w:type="spellStart"/>
+      <w:r>
+        <w:rPr>
+          <w:b w:val="0"/>
+          <w:bCs w:val="0"/>
+          <w:sz w:val="24"/>
+          <w:szCs w:val="24"/>
+        </w:rPr>
+        <w:t>și</w:t>
+      </w:r>
+      <w:proofErr w:type="spellEnd"/>
+      <w:r>
+        <w:rPr>
+          <w:b w:val="0"/>
+          <w:bCs w:val="0"/>
+          <w:sz w:val="24"/>
+          <w:szCs w:val="24"/>
+        </w:rPr>
+        <w:t xml:space="preserve"> al </w:t>
+      </w:r>
+      <w:proofErr w:type="spellStart"/>
+      <w:r>
+        <w:rPr>
+          <w:b w:val="0"/>
+          <w:bCs w:val="0"/>
+          <w:sz w:val="24"/>
+          <w:szCs w:val="24"/>
+        </w:rPr>
+        <w:t>unei</w:t>
+      </w:r>
+      <w:proofErr w:type="spellEnd"/>
+      <w:r>
+        <w:rPr>
+          <w:b w:val="0"/>
+          <w:bCs w:val="0"/>
+          <w:sz w:val="24"/>
+          <w:szCs w:val="24"/>
+        </w:rPr>
+        <w:t xml:space="preserve"> </w:t>
+      </w:r>
+      <w:proofErr w:type="spellStart"/>
+      <w:r>
+        <w:rPr>
+          <w:b w:val="0"/>
+          <w:bCs w:val="0"/>
+          <w:sz w:val="24"/>
+          <w:szCs w:val="24"/>
+        </w:rPr>
+        <w:t>antene</w:t>
+      </w:r>
+      <w:proofErr w:type="spellEnd"/>
+      <w:r>
+        <w:rPr>
+          <w:b w:val="0"/>
+          <w:bCs w:val="0"/>
+          <w:sz w:val="24"/>
+          <w:szCs w:val="24"/>
+        </w:rPr>
+        <w:t xml:space="preserve"> de </w:t>
+      </w:r>
+      <w:proofErr w:type="spellStart"/>
+      <w:r>
+        <w:rPr>
+          <w:b w:val="0"/>
+          <w:bCs w:val="0"/>
+          <w:sz w:val="24"/>
+          <w:szCs w:val="24"/>
+        </w:rPr>
+        <w:t>bază</w:t>
+      </w:r>
+      <w:proofErr w:type="spellEnd"/>
+      <w:r>
+        <w:rPr>
+          <w:b w:val="0"/>
+          <w:bCs w:val="0"/>
+          <w:sz w:val="24"/>
+          <w:szCs w:val="24"/>
+        </w:rPr>
+        <w:t xml:space="preserve"> acordate pe frecvența de 1090 MHz, orice utilizator comercial sau rău intenționat poate capta și decoda cei 112 biți ai mesajului. Astfel, adresa ICAO, altitudinea, viteza și coordonatele GNSS exacte devin date publice, ridicând preocupări majore privind confidențialitatea pentru aeronavele de stat, militare sau private.</w:t>
       </w:r>
     </w:p>
     <w:p>
@@ -1657,116 +2199,55 @@
           <w:sz w:val="24"/>
           <w:szCs w:val="24"/>
         </w:rPr>
-        <w:t xml:space="preserve">Prin intermediul tehnologiei SDR (echipamente radio </w:t>
-      </w:r>
-      <w:proofErr w:type="spellStart"/>
-      <w:r>
-        <w:rPr>
-          <w:b w:val="0"/>
-          <w:bCs w:val="0"/>
-          <w:sz w:val="24"/>
-          <w:szCs w:val="24"/>
-        </w:rPr>
-        <w:t>controlate</w:t>
-      </w:r>
-      <w:proofErr w:type="spellEnd"/>
-      <w:r>
-        <w:rPr>
-          <w:b w:val="0"/>
-          <w:bCs w:val="0"/>
-          <w:sz w:val="24"/>
-          <w:szCs w:val="24"/>
-        </w:rPr>
-        <w:t xml:space="preserve"> </w:t>
-      </w:r>
-      <w:proofErr w:type="spellStart"/>
-      <w:r>
-        <w:rPr>
-          <w:b w:val="0"/>
-          <w:bCs w:val="0"/>
-          <w:sz w:val="24"/>
-          <w:szCs w:val="24"/>
-        </w:rPr>
-        <w:t>prin</w:t>
-      </w:r>
-      <w:proofErr w:type="spellEnd"/>
-      <w:r>
-        <w:rPr>
-          <w:b w:val="0"/>
-          <w:bCs w:val="0"/>
-          <w:sz w:val="24"/>
-          <w:szCs w:val="24"/>
-        </w:rPr>
-        <w:t xml:space="preserve"> software</w:t>
-      </w:r>
-      <w:r>
-        <w:rPr>
-          <w:b w:val="0"/>
-          <w:bCs w:val="0"/>
-          <w:sz w:val="24"/>
-          <w:szCs w:val="24"/>
-        </w:rPr>
-        <w:t xml:space="preserve">) </w:t>
-      </w:r>
-      <w:proofErr w:type="spellStart"/>
-      <w:r>
-        <w:rPr>
-          <w:b w:val="0"/>
-          <w:bCs w:val="0"/>
-          <w:sz w:val="24"/>
-          <w:szCs w:val="24"/>
-        </w:rPr>
-        <w:t>și</w:t>
-      </w:r>
-      <w:proofErr w:type="spellEnd"/>
-      <w:r>
-        <w:rPr>
-          <w:b w:val="0"/>
-          <w:bCs w:val="0"/>
-          <w:sz w:val="24"/>
-          <w:szCs w:val="24"/>
-        </w:rPr>
-        <w:t xml:space="preserve"> al </w:t>
-      </w:r>
-      <w:proofErr w:type="spellStart"/>
-      <w:r>
-        <w:rPr>
-          <w:b w:val="0"/>
-          <w:bCs w:val="0"/>
-          <w:sz w:val="24"/>
-          <w:szCs w:val="24"/>
-        </w:rPr>
-        <w:t>unei</w:t>
-      </w:r>
-      <w:proofErr w:type="spellEnd"/>
-      <w:r>
-        <w:rPr>
-          <w:b w:val="0"/>
-          <w:bCs w:val="0"/>
-          <w:sz w:val="24"/>
-          <w:szCs w:val="24"/>
-        </w:rPr>
-        <w:t xml:space="preserve"> </w:t>
-      </w:r>
-      <w:proofErr w:type="spellStart"/>
-      <w:r>
-        <w:rPr>
-          <w:b w:val="0"/>
-          <w:bCs w:val="0"/>
-          <w:sz w:val="24"/>
-          <w:szCs w:val="24"/>
-        </w:rPr>
-        <w:t>antene</w:t>
-      </w:r>
-      <w:proofErr w:type="spellEnd"/>
-      <w:r>
-        <w:rPr>
-          <w:b w:val="0"/>
-          <w:bCs w:val="0"/>
-          <w:sz w:val="24"/>
-          <w:szCs w:val="24"/>
-        </w:rPr>
-        <w:t xml:space="preserve"> de bază acordate pe frecvența de 1090 MHz, orice utilizator comercial sau rău intenționat poate capta și decoda cei 112 biți ai mesajului. Astfel, adresa ICAO, altitudinea, viteza și coordonatele GNSS exacte devin date publice, ridicând preocupări majore privind confidențialitatea pentru aeronavele de stat, militare sau private.</w:t>
+        <w:t xml:space="preserve">Lipsa unui mecanism de autentificare face ca protocolul să fie vulnerabil nu doar la ascultare pasivă, ci și la atacuri cibernetice. Echipamentele SDR cu capacitate de emisie pot fi utilizate pentru a sintetiza și transmite mesaje 1090ES valide din punct de vedere sintactic, creând “aeronave fantomă” pe ecranele radar terestre sau chiar la nivelul </w:t>
+      </w:r>
+      <w:proofErr w:type="spellStart"/>
+      <w:r>
+        <w:rPr>
+          <w:b w:val="0"/>
+          <w:bCs w:val="0"/>
+          <w:sz w:val="24"/>
+          <w:szCs w:val="24"/>
+        </w:rPr>
+        <w:t>receptoarelor</w:t>
+      </w:r>
+      <w:proofErr w:type="spellEnd"/>
+      <w:r>
+        <w:rPr>
+          <w:b w:val="0"/>
+          <w:bCs w:val="0"/>
+          <w:sz w:val="24"/>
+          <w:szCs w:val="24"/>
+        </w:rPr>
+        <w:t xml:space="preserve"> de pe </w:t>
+      </w:r>
+      <w:proofErr w:type="spellStart"/>
+      <w:r>
+        <w:rPr>
+          <w:b w:val="0"/>
+          <w:bCs w:val="0"/>
+          <w:sz w:val="24"/>
+          <w:szCs w:val="24"/>
+        </w:rPr>
+        <w:t>sateliții</w:t>
+      </w:r>
+      <w:proofErr w:type="spellEnd"/>
+      <w:r>
+        <w:rPr>
+          <w:b w:val="0"/>
+          <w:bCs w:val="0"/>
+          <w:sz w:val="24"/>
+          <w:szCs w:val="24"/>
+        </w:rPr>
+        <w:t xml:space="preserve"> Iridium NEXT.</w:t>
+      </w:r>
+    </w:p>
+    <w:p>
+      <w:pPr>
+        <w:pStyle w:val="Heading2"/>
+      </w:pPr>
+      <w:r>
+        <w:t>3.5 Metode actuale de validare a datelor și atenuare a atacurilor de tip Spoofing</w:t>
       </w:r>
     </w:p>
     <w:p>
@@ -1788,57 +2269,127 @@
           <w:sz w:val="24"/>
           <w:szCs w:val="24"/>
         </w:rPr>
-        <w:t xml:space="preserve">Lipsa unui mecanism de autentificare face ca protocolul să fie vulnerabil nu doar la ascultare pasivă, ci și la atacuri cibernetice. Echipamentele SDR cu capacitate de emisie pot fi utilizate pentru a sintetiza și transmite mesaje 1090ES valide din punct de vedere sintactic, creând “aeronave fantomă” pe ecranele radar terestre sau chiar la nivelul receptoarelor de pe </w:t>
-      </w:r>
-      <w:proofErr w:type="spellStart"/>
-      <w:r>
-        <w:rPr>
-          <w:b w:val="0"/>
-          <w:bCs w:val="0"/>
-          <w:sz w:val="24"/>
-          <w:szCs w:val="24"/>
-        </w:rPr>
-        <w:t>sateliții</w:t>
-      </w:r>
-      <w:proofErr w:type="spellEnd"/>
-      <w:r>
-        <w:rPr>
-          <w:b w:val="0"/>
-          <w:bCs w:val="0"/>
-          <w:sz w:val="24"/>
-          <w:szCs w:val="24"/>
-        </w:rPr>
-        <w:t xml:space="preserve"> Iridium NEXT.</w:t>
-      </w:r>
-    </w:p>
-    <w:p>
-      <w:pPr>
-        <w:pStyle w:val="Heading2"/>
-      </w:pPr>
-      <w:r>
-        <w:t>3.5 Metode actuale de validare a datelor și atenuare a atacurilor de tip Spoofing</w:t>
-      </w:r>
-    </w:p>
-    <w:p>
-      <w:pPr>
-        <w:pStyle w:val="Heading2"/>
-        <w:ind w:firstLine="720"/>
-        <w:jc w:val="both"/>
-        <w:rPr>
-          <w:b w:val="0"/>
-          <w:bCs w:val="0"/>
-          <w:sz w:val="24"/>
-          <w:szCs w:val="24"/>
-        </w:rPr>
-      </w:pPr>
-      <w:r>
-        <w:rPr>
-          <w:b w:val="0"/>
-          <w:bCs w:val="0"/>
-          <w:sz w:val="24"/>
-          <w:szCs w:val="24"/>
-        </w:rPr>
-        <w:t xml:space="preserve">Deoarece modificarea standardului RTCA DO-260B pentru a include mecanisme criptografice ar necesita înlocuirea hardware-ului pe zeci de mii de aeronave la nivel global (eliminând compatibilitatea retroactivă), industria a adoptat o abordare de securitate la nivel de sistem. Stadiul actual al </w:t>
+        <w:t xml:space="preserve">Deoarece modificarea standardului RTCA DO-260B pentru a include mecanisme criptografice ar necesita înlocuirea hardware-ului pe zeci de mii de </w:t>
+      </w:r>
+      <w:proofErr w:type="spellStart"/>
+      <w:r>
+        <w:rPr>
+          <w:b w:val="0"/>
+          <w:bCs w:val="0"/>
+          <w:sz w:val="24"/>
+          <w:szCs w:val="24"/>
+        </w:rPr>
+        <w:t>aeronave</w:t>
+      </w:r>
+      <w:proofErr w:type="spellEnd"/>
+      <w:r>
+        <w:rPr>
+          <w:b w:val="0"/>
+          <w:bCs w:val="0"/>
+          <w:sz w:val="24"/>
+          <w:szCs w:val="24"/>
+        </w:rPr>
+        <w:t xml:space="preserve"> la </w:t>
+      </w:r>
+      <w:proofErr w:type="spellStart"/>
+      <w:r>
+        <w:rPr>
+          <w:b w:val="0"/>
+          <w:bCs w:val="0"/>
+          <w:sz w:val="24"/>
+          <w:szCs w:val="24"/>
+        </w:rPr>
+        <w:t>nivel</w:t>
+      </w:r>
+      <w:proofErr w:type="spellEnd"/>
+      <w:r>
+        <w:rPr>
+          <w:b w:val="0"/>
+          <w:bCs w:val="0"/>
+          <w:sz w:val="24"/>
+          <w:szCs w:val="24"/>
+        </w:rPr>
+        <w:t xml:space="preserve"> global, </w:t>
+      </w:r>
+      <w:proofErr w:type="spellStart"/>
+      <w:r>
+        <w:rPr>
+          <w:b w:val="0"/>
+          <w:bCs w:val="0"/>
+          <w:sz w:val="24"/>
+          <w:szCs w:val="24"/>
+        </w:rPr>
+        <w:t>industria</w:t>
+      </w:r>
+      <w:proofErr w:type="spellEnd"/>
+      <w:r>
+        <w:rPr>
+          <w:b w:val="0"/>
+          <w:bCs w:val="0"/>
+          <w:sz w:val="24"/>
+          <w:szCs w:val="24"/>
+        </w:rPr>
+        <w:t xml:space="preserve"> </w:t>
+      </w:r>
+      <w:proofErr w:type="gramStart"/>
+      <w:r>
+        <w:rPr>
+          <w:b w:val="0"/>
+          <w:bCs w:val="0"/>
+          <w:sz w:val="24"/>
+          <w:szCs w:val="24"/>
+        </w:rPr>
+        <w:t>a</w:t>
+      </w:r>
+      <w:proofErr w:type="gramEnd"/>
+      <w:r>
+        <w:rPr>
+          <w:b w:val="0"/>
+          <w:bCs w:val="0"/>
+          <w:sz w:val="24"/>
+          <w:szCs w:val="24"/>
+        </w:rPr>
+        <w:t xml:space="preserve"> </w:t>
+      </w:r>
+      <w:proofErr w:type="spellStart"/>
+      <w:r>
+        <w:rPr>
+          <w:b w:val="0"/>
+          <w:bCs w:val="0"/>
+          <w:sz w:val="24"/>
+          <w:szCs w:val="24"/>
+        </w:rPr>
+        <w:t>adoptat</w:t>
+      </w:r>
+      <w:proofErr w:type="spellEnd"/>
+      <w:r>
+        <w:rPr>
+          <w:b w:val="0"/>
+          <w:bCs w:val="0"/>
+          <w:sz w:val="24"/>
+          <w:szCs w:val="24"/>
+        </w:rPr>
+        <w:t xml:space="preserve"> o abordare de securitate la nivel de sistem. </w:t>
+      </w:r>
+      <w:proofErr w:type="spellStart"/>
+      <w:r>
+        <w:rPr>
+          <w:b w:val="0"/>
+          <w:bCs w:val="0"/>
+          <w:sz w:val="24"/>
+          <w:szCs w:val="24"/>
+        </w:rPr>
+        <w:t>Stadiul</w:t>
+      </w:r>
+      <w:proofErr w:type="spellEnd"/>
+      <w:r>
+        <w:rPr>
+          <w:b w:val="0"/>
+          <w:bCs w:val="0"/>
+          <w:sz w:val="24"/>
+          <w:szCs w:val="24"/>
+        </w:rPr>
+        <w:t xml:space="preserve"> actual al </w:t>
       </w:r>
       <w:proofErr w:type="spellStart"/>
       <w:r>
@@ -1938,7 +2489,27 @@
           <w:sz w:val="24"/>
           <w:szCs w:val="24"/>
         </w:rPr>
-        <w:t xml:space="preserve"> independentă a semnalului și pe corelarea datelor la nivelul serverelor centrale sau al sistemelor ATC (Air Traffic Control).</w:t>
+        <w:t xml:space="preserve"> </w:t>
+      </w:r>
+      <w:proofErr w:type="spellStart"/>
+      <w:r>
+        <w:rPr>
+          <w:b w:val="0"/>
+          <w:bCs w:val="0"/>
+          <w:sz w:val="24"/>
+          <w:szCs w:val="24"/>
+        </w:rPr>
+        <w:t>independentă</w:t>
+      </w:r>
+      <w:proofErr w:type="spellEnd"/>
+      <w:r>
+        <w:rPr>
+          <w:b w:val="0"/>
+          <w:bCs w:val="0"/>
+          <w:sz w:val="24"/>
+          <w:szCs w:val="24"/>
+        </w:rPr>
+        <w:t xml:space="preserve"> a semnalului și pe corelarea datelor la nivelul serverelor centrale sau al sistemelor ATC (Air Traffic Control).</w:t>
       </w:r>
     </w:p>
     <w:p>
@@ -1985,8 +2556,127 @@
           <w:sz w:val="24"/>
           <w:szCs w:val="24"/>
         </w:rPr>
-        <w:lastRenderedPageBreak/>
-        <w:t>Multilaterația (MLAT - Time Difference of Arrival): Este cea mai eficientă contra-măsură fizică implementată de rețelele terestre (precum Flightradar24). Când un emițător SDR transmite un mesaj ADS-B falsificat, semnalul radio este recepționat de multiple stații de la sol. Sistemul calculează diferența de timp la care semnalul a ajuns la fiecare receptor (TDOA la nivel de nanosecunde) pentru a triangula sursa fizică a emisiei. Dacă poziția fizică dedusă prin MLAT nu coincide cu coordonatele GNSS raportate în mesajul 1090ES, sistemul respinge datele ca fiind falsificate.</w:t>
+        <w:t xml:space="preserve">Multilaterația (MLAT - Time Difference of Arrival): Este cea mai eficientă contra-măsură fizică implementată de rețelele terestre (precum Flightradar24). Când un emițător SDR transmite un mesaj ADS-B falsificat, semnalul radio este recepționat de multiple stații de la sol. Sistemul calculează diferența de timp la care semnalul </w:t>
+      </w:r>
+      <w:proofErr w:type="gramStart"/>
+      <w:r>
+        <w:rPr>
+          <w:b w:val="0"/>
+          <w:bCs w:val="0"/>
+          <w:sz w:val="24"/>
+          <w:szCs w:val="24"/>
+        </w:rPr>
+        <w:t>a</w:t>
+      </w:r>
+      <w:proofErr w:type="gramEnd"/>
+      <w:r>
+        <w:rPr>
+          <w:b w:val="0"/>
+          <w:bCs w:val="0"/>
+          <w:sz w:val="24"/>
+          <w:szCs w:val="24"/>
+        </w:rPr>
+        <w:t xml:space="preserve"> </w:t>
+      </w:r>
+      <w:proofErr w:type="spellStart"/>
+      <w:r>
+        <w:rPr>
+          <w:b w:val="0"/>
+          <w:bCs w:val="0"/>
+          <w:sz w:val="24"/>
+          <w:szCs w:val="24"/>
+        </w:rPr>
+        <w:t>ajuns</w:t>
+      </w:r>
+      <w:proofErr w:type="spellEnd"/>
+      <w:r>
+        <w:rPr>
+          <w:b w:val="0"/>
+          <w:bCs w:val="0"/>
+          <w:sz w:val="24"/>
+          <w:szCs w:val="24"/>
+        </w:rPr>
+        <w:t xml:space="preserve"> la </w:t>
+      </w:r>
+      <w:proofErr w:type="spellStart"/>
+      <w:r>
+        <w:rPr>
+          <w:b w:val="0"/>
+          <w:bCs w:val="0"/>
+          <w:sz w:val="24"/>
+          <w:szCs w:val="24"/>
+        </w:rPr>
+        <w:t>fiecare</w:t>
+      </w:r>
+      <w:proofErr w:type="spellEnd"/>
+      <w:r>
+        <w:rPr>
+          <w:b w:val="0"/>
+          <w:bCs w:val="0"/>
+          <w:sz w:val="24"/>
+          <w:szCs w:val="24"/>
+        </w:rPr>
+        <w:t xml:space="preserve"> receptor </w:t>
+      </w:r>
+      <w:proofErr w:type="spellStart"/>
+      <w:r>
+        <w:rPr>
+          <w:b w:val="0"/>
+          <w:bCs w:val="0"/>
+          <w:sz w:val="24"/>
+          <w:szCs w:val="24"/>
+        </w:rPr>
+        <w:t>pentru</w:t>
+      </w:r>
+      <w:proofErr w:type="spellEnd"/>
+      <w:r>
+        <w:rPr>
+          <w:b w:val="0"/>
+          <w:bCs w:val="0"/>
+          <w:sz w:val="24"/>
+          <w:szCs w:val="24"/>
+        </w:rPr>
+        <w:t xml:space="preserve"> a </w:t>
+      </w:r>
+      <w:proofErr w:type="spellStart"/>
+      <w:r>
+        <w:rPr>
+          <w:b w:val="0"/>
+          <w:bCs w:val="0"/>
+          <w:sz w:val="24"/>
+          <w:szCs w:val="24"/>
+        </w:rPr>
+        <w:t>triangula</w:t>
+      </w:r>
+      <w:proofErr w:type="spellEnd"/>
+      <w:r>
+        <w:rPr>
+          <w:b w:val="0"/>
+          <w:bCs w:val="0"/>
+          <w:sz w:val="24"/>
+          <w:szCs w:val="24"/>
+        </w:rPr>
+        <w:t xml:space="preserve"> sursa fizică </w:t>
+      </w:r>
+      <w:proofErr w:type="gramStart"/>
+      <w:r>
+        <w:rPr>
+          <w:b w:val="0"/>
+          <w:bCs w:val="0"/>
+          <w:sz w:val="24"/>
+          <w:szCs w:val="24"/>
+        </w:rPr>
+        <w:t>a</w:t>
+      </w:r>
+      <w:proofErr w:type="gramEnd"/>
+      <w:r>
+        <w:rPr>
+          <w:b w:val="0"/>
+          <w:bCs w:val="0"/>
+          <w:sz w:val="24"/>
+          <w:szCs w:val="24"/>
+        </w:rPr>
+        <w:t xml:space="preserve"> emisiei. Dacă poziția fizică dedusă prin MLAT nu coincide cu coordonatele GNSS raportate în mesajul 1090ES, sistemul respinge datele ca fiind falsificate.</w:t>
       </w:r>
     </w:p>
     <w:p>
@@ -2036,6 +2726,7 @@
           <w:sz w:val="24"/>
           <w:szCs w:val="24"/>
         </w:rPr>
+        <w:lastRenderedPageBreak/>
         <w:t>Filtrarea cinematică (Plausibility Checks): Algoritmii de pe serverele de procesare analizează comportamentul zborului raportat. Variațiile imposibile de viteză, altitudine sau accelerație (ex. un viraj cu forțe G care depășesc limitele fizice ale aeronavei) care adesea însoțesc atacurile de spoofing rudimentare, duc la invalidarea automată a track-ului.</w:t>
       </w:r>
     </w:p>
@@ -2905,6 +3596,7 @@
   <w:style w:type="character" w:default="1" w:styleId="DefaultParagraphFont">
     <w:name w:val="Default Paragraph Font"/>
     <w:uiPriority w:val="1"/>
+    <w:semiHidden/>
     <w:unhideWhenUsed/>
   </w:style>
   <w:style w:type="table" w:default="1" w:styleId="TableNormal">

</xml_diff>